<commit_message>
fix: resolve SUP-C cross-volume audit findings (3 items)
Fix A (3A V3A-06): append HVF/LVF cortisol classification note linking
1.68±0.69 ng/mL naïve baseline to VSUP-C16's HVF ≤6 ng/mL range,
and clarifying LVF chronic 20-40 ng/mL vs acute C&R >150 ng/mL contexts.

Fix B (SUP-C Carry_Forward): insert DO dual-threshold clarification note
after SUP-C01+VSUP-C02 cite, explaining 1.8 mg/L (Chowan River onset)
vs 2.0 mg/L (multi-study consolidated threshold used by 0D1/1A/3A/3B1).

Fix C (README): add SUP-C to inheritance chart and supplement section,
documenting SUP-C -> 3A/3B1 dependency for LVF/HVF and Foraging Forays.

Co-authored-by: Copilot <223556219+Copilot@users.noreply.github.com>
</commit_message>
<xml_diff>
--- a/3A_高壓舊魚心理機制與誘咬本質.docx
+++ b/3A_高壓舊魚心理機制與誘咬本質.docx
@@ -6671,6 +6671,13 @@
         <w:t>V3A-06 Alert Reset Time 皮質醇動力學（台灣特定場景）：靜息皮質醇 1.68–10.69 ng/mL（均值 ~6.0 ng/mL）；C&amp;R 急性峰值 &gt;150 ng/mL（劇烈個體 200–300+ ng/mL）；12°C 釋放至水體中半衰期 ~16 hr；完整溫度矩陣（依 SUP-A VSUP-A04）：10°C=48.0 hr；15°C=33.9 hr；20°C=24.0 hr；22°C=20.9 hr；25°C=17.0 hr；30°C=12.0 hr；35°C=8.5 hr；台灣南部夏季（&gt;30°C + 底棲 Eh &lt; −150 mV 缺氧）警報重置時間可能無限延長（延遲性死亡風險）。。[信心等級：中]。</w:t>
       </w:r>
       <w:r/>
+      <w:r>
+        <w:rPr/>
+        <w:t xml:space="preserve">  （依 VSUP-C16 定義，此 1.68±0.69 ng/mL 屬 HVF 族群實測基準，HVF 分類範圍 ≤ 6 ng/mL；LVF 慢性基準為 20–40 ng/mL；急性 C&amp;R 飆升至 &gt;150 ng/mL 為獨立量測情境。）</w:t>
+      </w:r>
+      <w:r>
+        <w:t xml:space="preserve"> [VSUP-C16-note-added]</w:t>
+      </w:r>
     </w:p>
     <w:p>
       <w:pPr/>
@@ -17672,6 +17679,7 @@
         </w:rPr>
       </w:r>
     </w:p>
+    <w:p/>
     <w:sectPr>
       <w:pgSz w:h="15840" w:w="12240" w:orient="portrait"/>
       <w:pgMar w:bottom="1440" w:top="1440" w:left="1440" w:right="1440" w:header="0" w:footer="720"/>

</xml_diff>